<commit_message>
docx: secoes Poisson x Binomial Negativa + tempo de espera (Fase 3) e modos limpos + hotspot do cinto (guia)
</commit_message>
<xml_diff>
--- a/entregaveis/Documentacao_Fase3_Tortuga.docx
+++ b/entregaveis/Documentacao_Fase3_Tortuga.docx
@@ -946,7 +946,75 @@
           <w:color w:val="1D1D1F"/>
           <w:sz w:val="23"/>
         </w:rPr>
-        <w:t>5.5 Risco por área — sugestão da IA, decisão do gestor</w:t>
+        <w:t>5.5 Robustez: Poisson × Binomial Negativa (superdispersão)</w:t>
+      </w:r>
+    </w:p>
+    <w:p>
+      <w:pPr>
+        <w:spacing w:after="80"/>
+        <w:jc w:val="both"/>
+      </w:pPr>
+      <w:r>
+        <w:t>A Poisson supõe equidispersão (variância = média). Quando os operadores são heterogêneos — poucos concentram quase todas as ocorrências — a variância fica acima da média (superdispersão) e a Poisson pura ficaria confiante demais (intervalos estreitos, p-valores otimistas). Por isso o motor mede o índice de dispersão de Pearson φ = (1/gl)·Σ (kᵢ − λ₀·tᵢ)² / (λ₀·tᵢ). Se φ ≈ 1, mantém-se a Poisson (modelo mais parcimonioso); se φ &gt; 1,5, o motor escala para a Binomial Negativa / quasi-Poisson: alarga os intervalos de confiança por √φ e usa um p-valor robusto na decisão de significância — assim nunca fica confiante demais.</w:t>
+      </w:r>
+    </w:p>
+    <w:p>
+      <w:pPr>
+        <w:spacing w:after="80"/>
+        <w:jc w:val="both"/>
+      </w:pPr>
+      <w:r>
+        <w:rPr>
+          <w:b/>
+        </w:rPr>
+        <w:t xml:space="preserve">Não são opostas, são aninhadas. </w:t>
+      </w:r>
+      <w:r>
+        <w:t>A Binomial Negativa (Pascal) é a Poisson com taxa que varia de operador para operador (mistura Poisson–Gama), o que produz variância maior que a média; a Poisson é o caso particular sem dispersão extra. Começa-se pela mais simples e ativa-se a Binomial Negativa só quando os próprios dados pedem. O dashboard exibe o selo “Poisson validada” ou “Binomial Negativa ativada” e, por operador, a coluna Modelo e o p-valor robusto.</w:t>
+      </w:r>
+    </w:p>
+    <w:p>
+      <w:pPr>
+        <w:spacing w:before="120" w:after="40"/>
+      </w:pPr>
+      <w:r>
+        <w:rPr>
+          <w:b/>
+          <w:color w:val="1D1D1F"/>
+          <w:sz w:val="23"/>
+        </w:rPr>
+        <w:t>5.6 Tempo de espera: quando o próximo incidente (Geométrica = Binomial Negativa, r = 1)</w:t>
+      </w:r>
+    </w:p>
+    <w:p>
+      <w:pPr>
+        <w:spacing w:after="80"/>
+        <w:jc w:val="both"/>
+      </w:pPr>
+      <w:r>
+        <w:t>A Poisson responde qual a probabilidade no próximo turno; a Binomial Negativa responde também em quantos turnos o próximo incidente tende a ocorrer. Tratando cada turno como um ensaio de Bernoulli cujo “sucesso” é ter ≥1 evento (probabilidade p = 1 − e^(−λ̂)), o número de turnos até o próximo incidente segue a Geométrica — que é a Pascal/Binomial Negativa com r = 1 (“nº de tentativas até o 1º sucesso”): E[turnos até o próximo] = 1/p e P(≥1 incidente em m turnos) = 1 − (1 − p)^m.</w:t>
+      </w:r>
+    </w:p>
+    <w:p>
+      <w:pPr>
+        <w:spacing w:after="80"/>
+        <w:jc w:val="both"/>
+      </w:pPr>
+      <w:r>
+        <w:t>A faixa otimista–pessimista usa o intervalo de confiança robusto de λ̂ (já alargado por √φ): taxa maior implica espera menor, e vice-versa. Assim o mesmo modelo entrega as duas metades da decisão preventiva — a probabilidade (quem está em risco) e o tempo (quando agir). No dashboard, a linha de destaque “Próximo incidente previsto para OP-XXX em ~N turnos”.</w:t>
+      </w:r>
+    </w:p>
+    <w:p>
+      <w:pPr>
+        <w:spacing w:before="120" w:after="40"/>
+      </w:pPr>
+      <w:r>
+        <w:rPr>
+          <w:b/>
+          <w:color w:val="1D1D1F"/>
+          <w:sz w:val="23"/>
+        </w:rPr>
+        <w:t>5.7 Risco por área — sugestão da IA, decisão do gestor</w:t>
       </w:r>
     </w:p>
     <w:p>
@@ -971,7 +1039,7 @@
           <w:color w:val="1D1D1F"/>
           <w:sz w:val="23"/>
         </w:rPr>
-        <w:t>5.6 Estímulos out of the box (gamificação e feedback)</w:t>
+        <w:t>5.8 Estímulos out of the box (gamificação e feedback)</w:t>
       </w:r>
     </w:p>
     <w:p>
@@ -1029,7 +1097,7 @@
           <w:color w:val="1D1D1F"/>
           <w:sz w:val="23"/>
         </w:rPr>
-        <w:t>5.7 Privacidade, honestidade e limitações</w:t>
+        <w:t>5.9 Privacidade, honestidade e limitações</w:t>
       </w:r>
     </w:p>
     <w:p>

</xml_diff>

<commit_message>
Confianca do detector vira calibracao por ESTACAO (nao por operador): API, UI com aviso, set_confidence reescrito e documentacao
</commit_message>
<xml_diff>
--- a/entregaveis/Documentacao_Fase3_Tortuga.docx
+++ b/entregaveis/Documentacao_Fase3_Tortuga.docx
@@ -1602,7 +1602,7 @@
         <w:rPr>
           <w:b w:val="0"/>
         </w:rPr>
-        <w:t>Cada perfil define quais EPIs o sistema monitora e a confiança mínima do YOLO, configuráveis pelo gestor. Operadores em setores diferentes recebem regras diferentes, mesmo compartilhando cintos entre os 3 turnos.</w:t>
+        <w:t>Cada perfil define quais EPIs o sistema monitora para aquele operador, configuráveis pelo gestor. Operadores em setores diferentes recebem regras diferentes, mesmo compartilhando cintos entre os 3 turnos. A sensibilidade do detector (limiar de confiança do YOLO) NÃO faz parte do perfil: ela é calibração da câmera e fica na estação — ver 8.5.</w:t>
       </w:r>
     </w:p>
     <w:p>
@@ -1653,6 +1653,46 @@
           <w:b w:val="0"/>
         </w:rPr>
         <w:t>O sistema de visão envia cada evento detectado ao endpoint de ingestão, que o atribui automaticamente ao operador ativo na estação (resolvido pelo check-in via QR) e, se for evento de campo, faz push imediato ao cinto. Na banca, o histórico dá a base estatística e os eventos capturados ao vivo entram na hora, provando a operação com dados reais.</w:t>
+      </w:r>
+    </w:p>
+    <w:p>
+      <w:pPr>
+        <w:spacing w:before="120" w:after="40"/>
+      </w:pPr>
+      <w:r>
+        <w:rPr>
+          <w:b/>
+          <w:color w:val="1D1D1F"/>
+          <w:sz w:val="23"/>
+        </w:rPr>
+        <w:t>8.5 Calibração do detector e validade da comparação estatística</w:t>
+      </w:r>
+    </w:p>
+    <w:p>
+      <w:pPr>
+        <w:spacing w:after="80"/>
+        <w:jc w:val="both"/>
+      </w:pPr>
+      <w:r>
+        <w:t>O limiar de confiança do YOLO é propriedade do arranjo óptico — câmera, iluminação, distância e ângulo — e não do trabalhador. Por isso ele é configurado por ESTAÇÃO, e não por operador: todos os operadores que passam pela mesma câmera são medidos com o mesmo instrumento. Essa é a condição para que o teste de hipóteses seja legítimo, já que todos os operadores são comparados contra uma mesma linha de base λ0; limiares distintos por pessoa produziriam diferenças de contagem de origem puramente instrumental e sinalizariam operadores por configuração, não por comportamento.</w:t>
+      </w:r>
+    </w:p>
+    <w:p>
+      <w:pPr>
+        <w:spacing w:after="80"/>
+        <w:jc w:val="both"/>
+      </w:pPr>
+      <w:r>
+        <w:t>O sentido do ajuste merece atenção porque é contraintuitivo. Como o modelo é de classes só-positivas, um EPI que não for detectado é contabilizado como ausente. Elevar o limiar torna o detector mais exigente, reduz o reconhecimento de EPIs legítimos e portanto AUMENTA as violações registradas; reduzi-lo mascara violações reais. Em ambos os casos a taxa observada λ̂ se desloca sem qualquer mudança de comportamento, de modo que o limiar deve ser tratado como parte do protocolo de medição: fixado durante o período analisado, uniforme entre os operadores comparados e com a linha de base recalibrada após cada alteração.</w:t>
+      </w:r>
+    </w:p>
+    <w:p>
+      <w:pPr>
+        <w:spacing w:after="80"/>
+        <w:jc w:val="both"/>
+      </w:pPr>
+      <w:r>
+        <w:t>Para tornar isso auditável, cada evento registra o limiar vigente no momento da medição, valor que também integra a trilha de auditoria encadeada por hash. Assim é possível segmentar a análise por período de calibração e demonstrar que a comparação entre operadores permanece válida. A interface de configuração exibe esse alerta ao gestor, de modo que o sistema não depende de o usuário dominar a estatística subjacente para operá-lo com segurança.</w:t>
       </w:r>
     </w:p>
     <w:sectPr>

</xml_diff>